<commit_message>
Final Phase 1 + Phase 2 Accuracy Upgrade: Standard schema enforcement, domain topic filtering, strict boundary extraction, and V1 protection
</commit_message>
<xml_diff>
--- a/backend/tests/test_docs/01_BRD_Online_Library.docx
+++ b/backend/tests/test_docs/01_BRD_Online_Library.docx
@@ -48,6 +48,11 @@
     <w:p>
       <w:r>
         <w:t>BR-006: The platform shall allow members to renew active book loans online before the due date.</w:t>
+      </w:r>
+    </w:p>
+    <w:p>
+      <w:r>
+        <w:t>BR-007: The platform shall enforce maximum allowable loan quota limit per member and support mobile responsive access.</w:t>
       </w:r>
     </w:p>
     <w:p>

</xml_diff>